<commit_message>
Add MIT/Apache-2.0 license texts; regenerate gen-report fixture
Cargo.toml has declared "MIT OR Apache-2.0" without the license files;
add the standard pair ahead of publishing. Commit the regenerated
corpus/gen-report.docx and drop the "no remote yet" note.

Co-Authored-By: Claude Fable 5 <noreply@anthropic.com>
Claude-Session: https://claude.ai/code/session_01DukNFNY8B6z3YXCPaJUpZX
</commit_message>
<xml_diff>
--- a/corpus/gen-report.docx
+++ b/corpus/gen-report.docx
@@ -7,7 +7,7 @@
         <w:pStyle w:val="Title"/>
       </w:pPr>
       <w:r>
-        <w:t>Quarterly Report</w:t>
+        <w:t xml:space="preserve">Quarterly Report</w:t>
       </w:r>
     </w:p>
     <w:p>
@@ -15,7 +15,7 @@
         <w:pStyle w:val="Heading1"/>
       </w:pPr>
       <w:r>
-        <w:t>Summary</w:t>
+        <w:t xml:space="preserve">Summary</w:t>
       </w:r>
     </w:p>
     <w:p>
@@ -26,7 +26,7 @@
         <w:rPr>
           <w:b/>
         </w:rPr>
-        <w:t>exceeded</w:t>
+        <w:t xml:space="preserve">exceeded</w:t>
       </w:r>
       <w:r>
         <w:t xml:space="preserve"> projections in every region except </w:t>
@@ -36,10 +36,10 @@
           <w:i/>
           <w:color w:val="C00000"/>
         </w:rPr>
-        <w:t>EMEA</w:t>
+        <w:t xml:space="preserve">EMEA</w:t>
       </w:r>
       <w:r>
-        <w:t>, where currency effects reduced reported growth by roughly four points.</w:t>
+        <w:t xml:space="preserve">, where currency effects reduced reported growth by roughly four points.</w:t>
       </w:r>
     </w:p>
     <w:p>
@@ -47,7 +47,7 @@
         <w:pStyle w:val="Heading2"/>
       </w:pPr>
       <w:r>
-        <w:t>Regional detail</w:t>
+        <w:t xml:space="preserve">Regional detail</w:t>
       </w:r>
     </w:p>
     <w:p>
@@ -61,7 +61,7 @@
         <w:rPr>
           <w:u w:val="single"/>
         </w:rPr>
-        <w:t>Underlined</w:t>
+        <w:t xml:space="preserve">Underlined</w:t>
       </w:r>
       <w:r>
         <w:t xml:space="preserve"> and </w:t>
@@ -70,7 +70,7 @@
         <w:rPr>
           <w:strike/>
         </w:rPr>
-        <w:t>struck</w:t>
+        <w:t xml:space="preserve">struck</w:t>
       </w:r>
       <w:r>
         <w:t xml:space="preserve"> and x</w:t>
@@ -79,12 +79,12 @@
         <w:rPr>
           <w:vertAlign w:val="superscript"/>
         </w:rPr>
-        <w:t>2</w:t>
+        <w:t xml:space="preserve">2</w:t>
       </w:r>
       <w:r>
-        <w:t>.</w:t>
+        <w:t xml:space="preserve">.</w:t>
         <w:tab/>
-        <w:t>Tabbed text here.</w:t>
+        <w:t xml:space="preserve">Tabbed text here.</w:t>
       </w:r>
     </w:p>
     <w:p>
@@ -92,7 +92,7 @@
         <w:pStyle w:val="ListBullet"/>
       </w:pPr>
       <w:r>
-        <w:t>First bullet</w:t>
+        <w:t xml:space="preserve">First bullet</w:t>
       </w:r>
     </w:p>
     <w:p>
@@ -100,7 +100,7 @@
         <w:pStyle w:val="ListBullet"/>
       </w:pPr>
       <w:r>
-        <w:t>Second bullet</w:t>
+        <w:t xml:space="preserve">Second bullet</w:t>
       </w:r>
     </w:p>
     <w:p>
@@ -108,7 +108,7 @@
         <w:pStyle w:val="ListNumber"/>
       </w:pPr>
       <w:r>
-        <w:t>Numbered one</w:t>
+        <w:t xml:space="preserve">Numbered one</w:t>
       </w:r>
     </w:p>
     <w:p>
@@ -116,7 +116,7 @@
         <w:pStyle w:val="ListNumber"/>
       </w:pPr>
       <w:r>
-        <w:t>Numbered two</w:t>
+        <w:t xml:space="preserve">Numbered two</w:t>
       </w:r>
     </w:p>
     <w:p>
@@ -127,7 +127,7 @@
         <w:jc w:val="center"/>
       </w:pPr>
       <w:r>
-        <w:t>Centered paragraph with a hanging indent.</w:t>
+        <w:t xml:space="preserve">Centered paragraph with a hanging indent.</w:t>
       </w:r>
     </w:p>
     <w:tbl>
@@ -148,7 +148,7 @@
           </w:tcPr>
           <w:p>
             <w:r>
-              <w:t>r0c0</w:t>
+              <w:t xml:space="preserve">r0c0</w:t>
             </w:r>
           </w:p>
         </w:tc>
@@ -158,7 +158,7 @@
           </w:tcPr>
           <w:p>
             <w:r>
-              <w:t>r0c1</w:t>
+              <w:t xml:space="preserve">r0c1</w:t>
             </w:r>
           </w:p>
         </w:tc>
@@ -168,7 +168,7 @@
           </w:tcPr>
           <w:p>
             <w:r>
-              <w:t>r0c2</w:t>
+              <w:t xml:space="preserve">r0c2</w:t>
             </w:r>
           </w:p>
         </w:tc>
@@ -180,7 +180,7 @@
           </w:tcPr>
           <w:p>
             <w:r>
-              <w:t>r1c0</w:t>
+              <w:t xml:space="preserve">r1c0</w:t>
             </w:r>
           </w:p>
         </w:tc>
@@ -190,7 +190,7 @@
           </w:tcPr>
           <w:p>
             <w:r>
-              <w:t>r1c1</w:t>
+              <w:t xml:space="preserve">r1c1</w:t>
             </w:r>
           </w:p>
         </w:tc>
@@ -200,7 +200,7 @@
           </w:tcPr>
           <w:p>
             <w:r>
-              <w:t>r1c2</w:t>
+              <w:t xml:space="preserve">r1c2</w:t>
             </w:r>
           </w:p>
         </w:tc>
@@ -208,15 +208,13 @@
     </w:tbl>
     <w:p>
       <w:r>
-        <w:t>Text after the table, before a page break.</w:t>
-      </w:r>
-      <w:r>
+        <w:t xml:space="preserve">Text after the table, before a page break.</w:t>
         <w:br w:type="page"/>
       </w:r>
     </w:p>
     <w:p>
       <w:r>
-        <w:t>Appendix A — Methodology</w:t>
+        <w:t xml:space="preserve">Appendix A — Methodology</w:t>
       </w:r>
     </w:p>
     <w:p>

</xml_diff>